<commit_message>
added changes to cv
</commit_message>
<xml_diff>
--- a/assets/Ropafadzo Yotamo Curriculum Vitae.docx
+++ b/assets/Ropafadzo Yotamo Curriculum Vitae.docx
@@ -93,7 +93,6 @@
           <w:rFonts w:ascii="Aptos" w:hAnsi="Aptos"/>
           <w:color w:val="505050"/>
           <w:sz w:val="19"/>
-          <w:lang w:val="it-IT"/>
         </w:rPr>
       </w:pPr>
       <w:r>
@@ -101,7 +100,6 @@
           <w:rFonts w:ascii="Aptos" w:hAnsi="Aptos"/>
           <w:color w:val="505050"/>
           <w:sz w:val="19"/>
-          <w:lang w:val="it-IT"/>
         </w:rPr>
         <w:t xml:space="preserve">Portfolio: </w:t>
       </w:r>
@@ -111,7 +109,6 @@
           <w:color w:val="505050"/>
           <w:sz w:val="19"/>
           <w:u w:val="single" w:color="0070C0"/>
-          <w:lang w:val="it-IT"/>
         </w:rPr>
         <w:t>https://ropafadzo-yotamo.netlify.app</w:t>
       </w:r>
@@ -120,7 +117,6 @@
       <w:pPr>
         <w:rPr>
           <w:rFonts w:ascii="Aptos" w:hAnsi="Aptos"/>
-          <w:lang w:val="it-IT"/>
         </w:rPr>
       </w:pPr>
     </w:p>
@@ -1608,6 +1604,7 @@
       <w:pPr>
         <w:rPr>
           <w:rFonts w:ascii="Aptos" w:hAnsi="Aptos"/>
+          <w:b/>
         </w:rPr>
       </w:pPr>
       <w:r>
@@ -1617,13 +1614,61 @@
         </w:rPr>
         <w:t>PROFESSIONAL CERTIFICATES</w:t>
       </w:r>
+    </w:p>
+    <w:p>
+      <w:pPr>
+        <w:jc w:val="center"/>
+        <w:rPr>
+          <w:rFonts w:ascii="Aptos" w:hAnsi="Aptos"/>
+        </w:rPr>
+      </w:pPr>
       <w:r>
         <w:rPr>
           <w:rFonts w:ascii="Aptos" w:hAnsi="Aptos"/>
           <w:i/>
         </w:rPr>
         <w:br/>
-        <w:t>(To be attached following this page)</w:t>
+      </w:r>
+      <w:r>
+        <w:rPr>
+          <w:rFonts w:ascii="Aptos" w:hAnsi="Aptos"/>
+          <w:noProof/>
+        </w:rPr>
+        <w:drawing>
+          <wp:inline distT="0" distB="0" distL="0" distR="0" wp14:anchorId="3F03D35F" wp14:editId="372C70D8">
+            <wp:extent cx="5358809" cy="5220927"/>
+            <wp:effectExtent l="0" t="0" r="0" b="0"/>
+            <wp:docPr id="2105906128" name="Picture 8"/>
+            <wp:cNvGraphicFramePr>
+              <a:graphicFrameLocks xmlns:a="http://schemas.openxmlformats.org/drawingml/2006/main" noChangeAspect="1"/>
+            </wp:cNvGraphicFramePr>
+            <a:graphic xmlns:a="http://schemas.openxmlformats.org/drawingml/2006/main">
+              <a:graphicData uri="http://schemas.openxmlformats.org/drawingml/2006/picture">
+                <pic:pic xmlns:pic="http://schemas.openxmlformats.org/drawingml/2006/picture">
+                  <pic:nvPicPr>
+                    <pic:cNvPr id="2105906128" name="Picture 2105906128"/>
+                    <pic:cNvPicPr/>
+                  </pic:nvPicPr>
+                  <pic:blipFill>
+                    <a:blip r:embed="rId12"/>
+                    <a:stretch>
+                      <a:fillRect/>
+                    </a:stretch>
+                  </pic:blipFill>
+                  <pic:spPr>
+                    <a:xfrm>
+                      <a:off x="0" y="0"/>
+                      <a:ext cx="5427456" cy="5287808"/>
+                    </a:xfrm>
+                    <a:prstGeom prst="rect">
+                      <a:avLst/>
+                    </a:prstGeom>
+                  </pic:spPr>
+                </pic:pic>
+              </a:graphicData>
+            </a:graphic>
+          </wp:inline>
+        </w:drawing>
       </w:r>
     </w:p>
     <w:p>
@@ -1633,6 +1678,132 @@
           <w:rFonts w:ascii="Aptos" w:hAnsi="Aptos"/>
         </w:rPr>
       </w:pPr>
+      <w:r>
+        <w:rPr>
+          <w:rFonts w:ascii="Aptos" w:hAnsi="Aptos"/>
+          <w:noProof/>
+        </w:rPr>
+        <w:lastRenderedPageBreak/>
+        <w:drawing>
+          <wp:inline distT="0" distB="0" distL="0" distR="0" wp14:anchorId="6B5B1247" wp14:editId="41317F66">
+            <wp:extent cx="5486400" cy="7280275"/>
+            <wp:effectExtent l="0" t="0" r="0" b="0"/>
+            <wp:docPr id="1450433709" name="Picture 9"/>
+            <wp:cNvGraphicFramePr>
+              <a:graphicFrameLocks xmlns:a="http://schemas.openxmlformats.org/drawingml/2006/main" noChangeAspect="1"/>
+            </wp:cNvGraphicFramePr>
+            <a:graphic xmlns:a="http://schemas.openxmlformats.org/drawingml/2006/main">
+              <a:graphicData uri="http://schemas.openxmlformats.org/drawingml/2006/picture">
+                <pic:pic xmlns:pic="http://schemas.openxmlformats.org/drawingml/2006/picture">
+                  <pic:nvPicPr>
+                    <pic:cNvPr id="1450433709" name="Picture 1450433709"/>
+                    <pic:cNvPicPr/>
+                  </pic:nvPicPr>
+                  <pic:blipFill>
+                    <a:blip r:embed="rId13"/>
+                    <a:stretch>
+                      <a:fillRect/>
+                    </a:stretch>
+                  </pic:blipFill>
+                  <pic:spPr>
+                    <a:xfrm>
+                      <a:off x="0" y="0"/>
+                      <a:ext cx="5486400" cy="7280275"/>
+                    </a:xfrm>
+                    <a:prstGeom prst="rect">
+                      <a:avLst/>
+                    </a:prstGeom>
+                  </pic:spPr>
+                </pic:pic>
+              </a:graphicData>
+            </a:graphic>
+          </wp:inline>
+        </w:drawing>
+      </w:r>
+      <w:r>
+        <w:rPr>
+          <w:rFonts w:ascii="Aptos" w:hAnsi="Aptos"/>
+          <w:noProof/>
+        </w:rPr>
+        <w:lastRenderedPageBreak/>
+        <w:drawing>
+          <wp:inline distT="0" distB="0" distL="0" distR="0" wp14:anchorId="2804E1ED" wp14:editId="1CABB885">
+            <wp:extent cx="5486400" cy="7561580"/>
+            <wp:effectExtent l="0" t="0" r="0" b="1270"/>
+            <wp:docPr id="1360540298" name="Picture 10"/>
+            <wp:cNvGraphicFramePr>
+              <a:graphicFrameLocks xmlns:a="http://schemas.openxmlformats.org/drawingml/2006/main" noChangeAspect="1"/>
+            </wp:cNvGraphicFramePr>
+            <a:graphic xmlns:a="http://schemas.openxmlformats.org/drawingml/2006/main">
+              <a:graphicData uri="http://schemas.openxmlformats.org/drawingml/2006/picture">
+                <pic:pic xmlns:pic="http://schemas.openxmlformats.org/drawingml/2006/picture">
+                  <pic:nvPicPr>
+                    <pic:cNvPr id="1360540298" name="Picture 1360540298"/>
+                    <pic:cNvPicPr/>
+                  </pic:nvPicPr>
+                  <pic:blipFill>
+                    <a:blip r:embed="rId14"/>
+                    <a:stretch>
+                      <a:fillRect/>
+                    </a:stretch>
+                  </pic:blipFill>
+                  <pic:spPr>
+                    <a:xfrm>
+                      <a:off x="0" y="0"/>
+                      <a:ext cx="5486400" cy="7561580"/>
+                    </a:xfrm>
+                    <a:prstGeom prst="rect">
+                      <a:avLst/>
+                    </a:prstGeom>
+                  </pic:spPr>
+                </pic:pic>
+              </a:graphicData>
+            </a:graphic>
+          </wp:inline>
+        </w:drawing>
+      </w:r>
+      <w:r>
+        <w:rPr>
+          <w:rFonts w:ascii="Aptos" w:hAnsi="Aptos"/>
+          <w:noProof/>
+        </w:rPr>
+        <w:lastRenderedPageBreak/>
+        <w:drawing>
+          <wp:inline distT="0" distB="0" distL="0" distR="0" wp14:anchorId="2F64371F" wp14:editId="02D29A9D">
+            <wp:extent cx="5486400" cy="8008620"/>
+            <wp:effectExtent l="0" t="0" r="0" b="0"/>
+            <wp:docPr id="1155152071" name="Picture 11"/>
+            <wp:cNvGraphicFramePr>
+              <a:graphicFrameLocks xmlns:a="http://schemas.openxmlformats.org/drawingml/2006/main" noChangeAspect="1"/>
+            </wp:cNvGraphicFramePr>
+            <a:graphic xmlns:a="http://schemas.openxmlformats.org/drawingml/2006/main">
+              <a:graphicData uri="http://schemas.openxmlformats.org/drawingml/2006/picture">
+                <pic:pic xmlns:pic="http://schemas.openxmlformats.org/drawingml/2006/picture">
+                  <pic:nvPicPr>
+                    <pic:cNvPr id="1155152071" name="Picture 1155152071"/>
+                    <pic:cNvPicPr/>
+                  </pic:nvPicPr>
+                  <pic:blipFill>
+                    <a:blip r:embed="rId15"/>
+                    <a:stretch>
+                      <a:fillRect/>
+                    </a:stretch>
+                  </pic:blipFill>
+                  <pic:spPr>
+                    <a:xfrm>
+                      <a:off x="0" y="0"/>
+                      <a:ext cx="5486400" cy="8008620"/>
+                    </a:xfrm>
+                    <a:prstGeom prst="rect">
+                      <a:avLst/>
+                    </a:prstGeom>
+                  </pic:spPr>
+                </pic:pic>
+              </a:graphicData>
+            </a:graphic>
+          </wp:inline>
+        </w:drawing>
+      </w:r>
     </w:p>
     <w:p>
       <w:pPr>
@@ -1645,6 +1816,7 @@
           <w:rFonts w:ascii="Aptos" w:hAnsi="Aptos"/>
           <w:b/>
         </w:rPr>
+        <w:lastRenderedPageBreak/>
         <w:t xml:space="preserve">HOBBIES: </w:t>
       </w:r>
       <w:r>
@@ -1720,7 +1892,7 @@
                           <pic:cNvPicPr/>
                         </pic:nvPicPr>
                         <pic:blipFill>
-                          <a:blip r:embed="rId12"/>
+                          <a:blip r:embed="rId16"/>
                           <a:stretch>
                             <a:fillRect/>
                           </a:stretch>
@@ -1873,7 +2045,7 @@
         <v:path o:extrusionok="f" gradientshapeok="t" o:connecttype="rect"/>
         <o:lock v:ext="edit" aspectratio="t"/>
       </v:shapetype>
-      <v:shape id="_x0000_i1025" type="#_x0000_t75" style="width:468pt;height:249.75pt" o:bullet="t">
+      <v:shape id="_x0000_i1025" type="#_x0000_t75" style="width:468pt;height:249.5pt" o:bullet="t">
         <v:imagedata r:id="rId1" o:title="water-drop-liquid-splash-wet-clean-wallpaper[1]"/>
       </v:shape>
     </w:pict>

</xml_diff>